<commit_message>
Make launcher persistent exclusive and movable
</commit_message>
<xml_diff>
--- a/docs/RadioControllerLauncher_操作説明書.docx
+++ b/docs/RadioControllerLauncher_操作説明書.docx
@@ -64,7 +64,7 @@
         <w:pStyle w:val="FirstParagraph"/>
       </w:pPr>
       <w:r>
-        <w:t xml:space="preserve">Radio Controller Launcherは、KX3 Controller、FT-817 Controller、FT-857D / FT-897D ControllerのいずれかをmacOSのメニューバーから個別に起動するアプリです。</w:t>
+        <w:t xml:space="preserve">Radio Controller Launcherは、KX3 Controller、FT-817 Controller、FT-857D / FT-897D Controllerのいずれかを移動可能な選択画面から個別に起動するアプリです。</w:t>
       </w:r>
     </w:p>
     <w:p>
@@ -106,7 +106,7 @@
         <w:pStyle w:val="Compact"/>
       </w:pPr>
       <w:r>
-        <w:t xml:space="preserve">Dockには表示されず、メニューバーにアンテナアイコンが表示されます。</w:t>
+        <w:t xml:space="preserve">「無線機コントローラー」画面が表示されます。</w:t>
       </w:r>
     </w:p>
     <w:p>
@@ -118,7 +118,7 @@
         <w:pStyle w:val="Compact"/>
       </w:pPr>
       <w:r>
-        <w:t xml:space="preserve">アイコンを押してメニューを開きます。</w:t>
+        <w:t xml:space="preserve">タイトルバーをドラッグすると好きな位置へ移動できます。</w:t>
       </w:r>
     </w:p>
     <w:bookmarkEnd w:id="21"/>
@@ -180,7 +180,15 @@
         <w:pStyle w:val="FirstParagraph"/>
       </w:pPr>
       <w:r>
-        <w:t xml:space="preserve">起動済みのControllerには「起動中」とチェックアイコンが表示されます。起動済み項目を選ぶと、そのControllerを前面へ表示します。「すべて起動」機能はありません。</w:t>
+        <w:t xml:space="preserve">起動済みのControllerには「起動中」とチェックアイコンが表示されます。起動済み項目を選ぶと、そのControllerを前面へ表示します。「すべて起動」機能はありません。Controllerを起動した後もランチャーは終了せず、引き続き利用できます。</w:t>
+      </w:r>
+    </w:p>
+    <w:p>
+      <w:pPr>
+        <w:pStyle w:val="BodyText"/>
+      </w:pPr>
+      <w:r>
+        <w:t xml:space="preserve">別のControllerが起動中に機種を選択すると、起動中のControllerへ通常終了を要求します。終了を確認してから選択したControllerを起動するため、複数のControllerは同時起動しません。終了できなかった場合は安全のため新しいControllerを起動しません。</w:t>
       </w:r>
     </w:p>
     <w:bookmarkEnd w:id="22"/>

</xml_diff>